<commit_message>
ISO 27001: cela jmena v zaznamech ZAZ (nahrada prezdivek) + DOC-00 doplnen seznam ZAZ (v0.2) + ZAZ-00-02 - Kristy/Claude-24
</commit_message>
<xml_diff>
--- a/docs/ISO27001/DOC-00_Seznam_dokumentu_ISMS.docx
+++ b/docs/ISO27001/DOC-00_Seznam_dokumentu_ISMS.docx
@@ -196,7 +196,7 @@
                 <w:sz w:val="20"/>
                 <w:szCs w:val="20"/>
               </w:rPr>
-              <w:t xml:space="preserve">0.1 (návrh)</w:t>
+              <w:t xml:space="preserve">0.2 (návrh)</w:t>
             </w:r>
           </w:p>
         </w:tc>
@@ -842,6 +842,136 @@
                 <w:szCs w:val="20"/>
               </w:rPr>
               <w:t xml:space="preserve">STRATEGIE / Claude</w:t>
+            </w:r>
+          </w:p>
+        </w:tc>
+      </w:tr>
+      <w:tr>
+        <w:tc>
+          <w:tcPr>
+            <w:tcW w:type="dxa" w:w="1400"/>
+            <w:tcBorders>
+              <w:top w:val="single" w:color="BBBBBB" w:sz="1"/>
+              <w:left w:val="single" w:color="BBBBBB" w:sz="1"/>
+              <w:bottom w:val="single" w:color="BBBBBB" w:sz="1"/>
+              <w:right w:val="single" w:color="BBBBBB" w:sz="1"/>
+            </w:tcBorders>
+            <w:tcMar>
+              <w:top w:type="dxa" w:w="60"/>
+              <w:left w:type="dxa" w:w="110"/>
+              <w:bottom w:type="dxa" w:w="60"/>
+              <w:right w:type="dxa" w:w="110"/>
+            </w:tcMar>
+            <w:vAlign w:val="center"/>
+          </w:tcPr>
+          <w:p>
+            <w:pPr>
+              <w:spacing w:after="0" w:line="252"/>
+            </w:pPr>
+            <w:r>
+              <w:rPr>
+                <w:b w:val="false"/>
+                <w:bCs w:val="false"/>
+                <w:sz w:val="20"/>
+                <w:szCs w:val="20"/>
+              </w:rPr>
+              <w:t xml:space="preserve">0.2</w:t>
+            </w:r>
+          </w:p>
+        </w:tc>
+        <w:tc>
+          <w:tcPr>
+            <w:tcW w:type="dxa" w:w="1800"/>
+            <w:tcBorders>
+              <w:top w:val="single" w:color="BBBBBB" w:sz="1"/>
+              <w:left w:val="single" w:color="BBBBBB" w:sz="1"/>
+              <w:bottom w:val="single" w:color="BBBBBB" w:sz="1"/>
+              <w:right w:val="single" w:color="BBBBBB" w:sz="1"/>
+            </w:tcBorders>
+            <w:tcMar>
+              <w:top w:type="dxa" w:w="60"/>
+              <w:left w:type="dxa" w:w="110"/>
+              <w:bottom w:type="dxa" w:w="60"/>
+              <w:right w:type="dxa" w:w="110"/>
+            </w:tcMar>
+            <w:vAlign w:val="center"/>
+          </w:tcPr>
+          <w:p>
+            <w:pPr>
+              <w:spacing w:after="0" w:line="252"/>
+            </w:pPr>
+            <w:r>
+              <w:rPr>
+                <w:b w:val="false"/>
+                <w:bCs w:val="false"/>
+                <w:sz w:val="20"/>
+                <w:szCs w:val="20"/>
+              </w:rPr>
+              <w:t xml:space="preserve">13. 7. 2026</w:t>
+            </w:r>
+          </w:p>
+        </w:tc>
+        <w:tc>
+          <w:tcPr>
+            <w:tcW w:type="dxa" w:w="3826"/>
+            <w:tcBorders>
+              <w:top w:val="single" w:color="BBBBBB" w:sz="1"/>
+              <w:left w:val="single" w:color="BBBBBB" w:sz="1"/>
+              <w:bottom w:val="single" w:color="BBBBBB" w:sz="1"/>
+              <w:right w:val="single" w:color="BBBBBB" w:sz="1"/>
+            </w:tcBorders>
+            <w:tcMar>
+              <w:top w:type="dxa" w:w="60"/>
+              <w:left w:type="dxa" w:w="110"/>
+              <w:bottom w:type="dxa" w:w="60"/>
+              <w:right w:type="dxa" w:w="110"/>
+            </w:tcMar>
+            <w:vAlign w:val="center"/>
+          </w:tcPr>
+          <w:p>
+            <w:pPr>
+              <w:spacing w:after="0" w:line="252"/>
+            </w:pPr>
+            <w:r>
+              <w:rPr>
+                <w:b w:val="false"/>
+                <w:bCs w:val="false"/>
+                <w:sz w:val="20"/>
+                <w:szCs w:val="20"/>
+              </w:rPr>
+              <w:t xml:space="preserve">Doplněn seznam návazných záznamů (řada ZAZ)</w:t>
+            </w:r>
+          </w:p>
+        </w:tc>
+        <w:tc>
+          <w:tcPr>
+            <w:tcW w:type="dxa" w:w="2000"/>
+            <w:tcBorders>
+              <w:top w:val="single" w:color="BBBBBB" w:sz="1"/>
+              <w:left w:val="single" w:color="BBBBBB" w:sz="1"/>
+              <w:bottom w:val="single" w:color="BBBBBB" w:sz="1"/>
+              <w:right w:val="single" w:color="BBBBBB" w:sz="1"/>
+            </w:tcBorders>
+            <w:tcMar>
+              <w:top w:type="dxa" w:w="60"/>
+              <w:left w:type="dxa" w:w="110"/>
+              <w:bottom w:type="dxa" w:w="60"/>
+              <w:right w:type="dxa" w:w="110"/>
+            </w:tcMar>
+            <w:vAlign w:val="center"/>
+          </w:tcPr>
+          <w:p>
+            <w:pPr>
+              <w:spacing w:after="0" w:line="252"/>
+            </w:pPr>
+            <w:r>
+              <w:rPr>
+                <w:b w:val="false"/>
+                <w:bCs w:val="false"/>
+                <w:sz w:val="20"/>
+                <w:szCs w:val="20"/>
+              </w:rPr>
+              <w:t xml:space="preserve">STRATEGIE / Claude-24</w:t>
             </w:r>
           </w:p>
         </w:tc>
@@ -2779,7 +2909,1230 @@
         <w:pStyle w:val="Heading1"/>
       </w:pPr>
       <w:r>
-        <w:t xml:space="preserve">3. Poznámka</w:t>
+        <w:t xml:space="preserve">3. Návazné záznamy (řada ZAZ)</w:t>
+      </w:r>
+    </w:p>
+    <w:p>
+      <w:pPr>
+        <w:spacing w:after="120" w:line="264"/>
+      </w:pPr>
+      <w:r>
+        <w:rPr>
+          <w:sz w:val="20"/>
+          <w:szCs w:val="20"/>
+        </w:rPr>
+        <w:t xml:space="preserve">Návazné záznamy (řada ZAZ) dokládají, jak jednotlivé politiky fungují v praxi (realita a přezkum). Jsou samostatné a průběžně se aktualizují; nemění text mateřských dokumentů.</w:t>
+      </w:r>
+    </w:p>
+    <w:tbl>
+      <w:tblPr>
+        <w:tblW w:type="dxa" w:w="9026"/>
+        <w:tblBorders>
+          <w:top w:val="single" w:color="auto" w:sz="4"/>
+          <w:left w:val="single" w:color="auto" w:sz="4"/>
+          <w:bottom w:val="single" w:color="auto" w:sz="4"/>
+          <w:right w:val="single" w:color="auto" w:sz="4"/>
+          <w:insideH w:val="single" w:color="auto" w:sz="4"/>
+          <w:insideV w:val="single" w:color="auto" w:sz="4"/>
+        </w:tblBorders>
+      </w:tblPr>
+      <w:tblGrid>
+        <w:gridCol w:w="1200"/>
+        <w:gridCol w:w="3400"/>
+        <w:gridCol w:w="4426"/>
+      </w:tblGrid>
+      <w:tr>
+        <w:trPr>
+          <w:tblHeader/>
+        </w:trPr>
+        <w:tc>
+          <w:tcPr>
+            <w:tcW w:type="dxa" w:w="1200"/>
+            <w:tcBorders>
+              <w:top w:val="single" w:color="BBBBBB" w:sz="1"/>
+              <w:left w:val="single" w:color="BBBBBB" w:sz="1"/>
+              <w:bottom w:val="single" w:color="BBBBBB" w:sz="1"/>
+              <w:right w:val="single" w:color="BBBBBB" w:sz="1"/>
+            </w:tcBorders>
+            <w:shd w:fill="1F3A5F" w:val="clear"/>
+            <w:tcMar>
+              <w:top w:type="dxa" w:w="60"/>
+              <w:left w:type="dxa" w:w="110"/>
+              <w:bottom w:type="dxa" w:w="60"/>
+              <w:right w:type="dxa" w:w="110"/>
+            </w:tcMar>
+            <w:vAlign w:val="center"/>
+          </w:tcPr>
+          <w:p>
+            <w:pPr>
+              <w:spacing w:after="0" w:line="252"/>
+            </w:pPr>
+            <w:r>
+              <w:rPr>
+                <w:b/>
+                <w:bCs/>
+                <w:color w:val="FFFFFF"/>
+                <w:sz w:val="20"/>
+                <w:szCs w:val="20"/>
+              </w:rPr>
+              <w:t xml:space="preserve">Kód</w:t>
+            </w:r>
+          </w:p>
+        </w:tc>
+        <w:tc>
+          <w:tcPr>
+            <w:tcW w:type="dxa" w:w="3400"/>
+            <w:tcBorders>
+              <w:top w:val="single" w:color="BBBBBB" w:sz="1"/>
+              <w:left w:val="single" w:color="BBBBBB" w:sz="1"/>
+              <w:bottom w:val="single" w:color="BBBBBB" w:sz="1"/>
+              <w:right w:val="single" w:color="BBBBBB" w:sz="1"/>
+            </w:tcBorders>
+            <w:shd w:fill="1F3A5F" w:val="clear"/>
+            <w:tcMar>
+              <w:top w:type="dxa" w:w="60"/>
+              <w:left w:type="dxa" w:w="110"/>
+              <w:bottom w:type="dxa" w:w="60"/>
+              <w:right w:type="dxa" w:w="110"/>
+            </w:tcMar>
+            <w:vAlign w:val="center"/>
+          </w:tcPr>
+          <w:p>
+            <w:pPr>
+              <w:spacing w:after="0" w:line="252"/>
+            </w:pPr>
+            <w:r>
+              <w:rPr>
+                <w:b/>
+                <w:bCs/>
+                <w:color w:val="FFFFFF"/>
+                <w:sz w:val="20"/>
+                <w:szCs w:val="20"/>
+              </w:rPr>
+              <w:t xml:space="preserve">Název záznamu</w:t>
+            </w:r>
+          </w:p>
+        </w:tc>
+        <w:tc>
+          <w:tcPr>
+            <w:tcW w:type="dxa" w:w="4426"/>
+            <w:tcBorders>
+              <w:top w:val="single" w:color="BBBBBB" w:sz="1"/>
+              <w:left w:val="single" w:color="BBBBBB" w:sz="1"/>
+              <w:bottom w:val="single" w:color="BBBBBB" w:sz="1"/>
+              <w:right w:val="single" w:color="BBBBBB" w:sz="1"/>
+            </w:tcBorders>
+            <w:shd w:fill="1F3A5F" w:val="clear"/>
+            <w:tcMar>
+              <w:top w:type="dxa" w:w="60"/>
+              <w:left w:type="dxa" w:w="110"/>
+              <w:bottom w:type="dxa" w:w="60"/>
+              <w:right w:type="dxa" w:w="110"/>
+            </w:tcMar>
+            <w:vAlign w:val="center"/>
+          </w:tcPr>
+          <w:p>
+            <w:pPr>
+              <w:spacing w:after="0" w:line="252"/>
+            </w:pPr>
+            <w:r>
+              <w:rPr>
+                <w:b/>
+                <w:bCs/>
+                <w:color w:val="FFFFFF"/>
+                <w:sz w:val="20"/>
+                <w:szCs w:val="20"/>
+              </w:rPr>
+              <w:t xml:space="preserve">Navazuje na</w:t>
+            </w:r>
+          </w:p>
+        </w:tc>
+      </w:tr>
+      <w:tr>
+        <w:tc>
+          <w:tcPr>
+            <w:tcW w:type="dxa" w:w="1200"/>
+            <w:tcBorders>
+              <w:top w:val="single" w:color="BBBBBB" w:sz="1"/>
+              <w:left w:val="single" w:color="BBBBBB" w:sz="1"/>
+              <w:bottom w:val="single" w:color="BBBBBB" w:sz="1"/>
+              <w:right w:val="single" w:color="BBBBBB" w:sz="1"/>
+            </w:tcBorders>
+            <w:tcMar>
+              <w:top w:type="dxa" w:w="60"/>
+              <w:left w:type="dxa" w:w="110"/>
+              <w:bottom w:type="dxa" w:w="60"/>
+              <w:right w:type="dxa" w:w="110"/>
+            </w:tcMar>
+            <w:vAlign w:val="center"/>
+          </w:tcPr>
+          <w:p>
+            <w:pPr>
+              <w:spacing w:after="0" w:line="252"/>
+            </w:pPr>
+            <w:r>
+              <w:rPr>
+                <w:b w:val="false"/>
+                <w:bCs w:val="false"/>
+                <w:sz w:val="20"/>
+                <w:szCs w:val="20"/>
+              </w:rPr>
+              <w:t xml:space="preserve">ZAZ-00-01</w:t>
+            </w:r>
+          </w:p>
+        </w:tc>
+        <w:tc>
+          <w:tcPr>
+            <w:tcW w:type="dxa" w:w="3400"/>
+            <w:tcBorders>
+              <w:top w:val="single" w:color="BBBBBB" w:sz="1"/>
+              <w:left w:val="single" w:color="BBBBBB" w:sz="1"/>
+              <w:bottom w:val="single" w:color="BBBBBB" w:sz="1"/>
+              <w:right w:val="single" w:color="BBBBBB" w:sz="1"/>
+            </w:tcBorders>
+            <w:tcMar>
+              <w:top w:type="dxa" w:w="60"/>
+              <w:left w:type="dxa" w:w="110"/>
+              <w:bottom w:type="dxa" w:w="60"/>
+              <w:right w:type="dxa" w:w="110"/>
+            </w:tcMar>
+            <w:vAlign w:val="center"/>
+          </w:tcPr>
+          <w:p>
+            <w:pPr>
+              <w:spacing w:after="0" w:line="252"/>
+            </w:pPr>
+            <w:r>
+              <w:rPr>
+                <w:b w:val="false"/>
+                <w:bCs w:val="false"/>
+                <w:sz w:val="20"/>
+                <w:szCs w:val="20"/>
+              </w:rPr>
+              <w:t xml:space="preserve">Přezkum a aktualizace dokumentace ISMS</w:t>
+            </w:r>
+          </w:p>
+        </w:tc>
+        <w:tc>
+          <w:tcPr>
+            <w:tcW w:type="dxa" w:w="4426"/>
+            <w:tcBorders>
+              <w:top w:val="single" w:color="BBBBBB" w:sz="1"/>
+              <w:left w:val="single" w:color="BBBBBB" w:sz="1"/>
+              <w:bottom w:val="single" w:color="BBBBBB" w:sz="1"/>
+              <w:right w:val="single" w:color="BBBBBB" w:sz="1"/>
+            </w:tcBorders>
+            <w:tcMar>
+              <w:top w:type="dxa" w:w="60"/>
+              <w:left w:type="dxa" w:w="110"/>
+              <w:bottom w:type="dxa" w:w="60"/>
+              <w:right w:type="dxa" w:w="110"/>
+            </w:tcMar>
+            <w:vAlign w:val="center"/>
+          </w:tcPr>
+          <w:p>
+            <w:pPr>
+              <w:spacing w:after="0" w:line="252"/>
+            </w:pPr>
+            <w:r>
+              <w:rPr>
+                <w:b w:val="false"/>
+                <w:bCs w:val="false"/>
+                <w:sz w:val="20"/>
+                <w:szCs w:val="20"/>
+              </w:rPr>
+              <w:t xml:space="preserve">DOC-00</w:t>
+            </w:r>
+          </w:p>
+        </w:tc>
+      </w:tr>
+      <w:tr>
+        <w:tc>
+          <w:tcPr>
+            <w:tcW w:type="dxa" w:w="1200"/>
+            <w:tcBorders>
+              <w:top w:val="single" w:color="BBBBBB" w:sz="1"/>
+              <w:left w:val="single" w:color="BBBBBB" w:sz="1"/>
+              <w:bottom w:val="single" w:color="BBBBBB" w:sz="1"/>
+              <w:right w:val="single" w:color="BBBBBB" w:sz="1"/>
+            </w:tcBorders>
+            <w:tcMar>
+              <w:top w:type="dxa" w:w="60"/>
+              <w:left w:type="dxa" w:w="110"/>
+              <w:bottom w:type="dxa" w:w="60"/>
+              <w:right w:type="dxa" w:w="110"/>
+            </w:tcMar>
+            <w:vAlign w:val="center"/>
+          </w:tcPr>
+          <w:p>
+            <w:pPr>
+              <w:spacing w:after="0" w:line="252"/>
+            </w:pPr>
+            <w:r>
+              <w:rPr>
+                <w:b w:val="false"/>
+                <w:bCs w:val="false"/>
+                <w:sz w:val="20"/>
+                <w:szCs w:val="20"/>
+              </w:rPr>
+              <w:t xml:space="preserve">ZAZ-00-02</w:t>
+            </w:r>
+          </w:p>
+        </w:tc>
+        <w:tc>
+          <w:tcPr>
+            <w:tcW w:type="dxa" w:w="3400"/>
+            <w:tcBorders>
+              <w:top w:val="single" w:color="BBBBBB" w:sz="1"/>
+              <w:left w:val="single" w:color="BBBBBB" w:sz="1"/>
+              <w:bottom w:val="single" w:color="BBBBBB" w:sz="1"/>
+              <w:right w:val="single" w:color="BBBBBB" w:sz="1"/>
+            </w:tcBorders>
+            <w:tcMar>
+              <w:top w:type="dxa" w:w="60"/>
+              <w:left w:type="dxa" w:w="110"/>
+              <w:bottom w:type="dxa" w:w="60"/>
+              <w:right w:type="dxa" w:w="110"/>
+            </w:tcMar>
+            <w:vAlign w:val="center"/>
+          </w:tcPr>
+          <w:p>
+            <w:pPr>
+              <w:spacing w:after="0" w:line="252"/>
+            </w:pPr>
+            <w:r>
+              <w:rPr>
+                <w:b w:val="false"/>
+                <w:bCs w:val="false"/>
+                <w:sz w:val="20"/>
+                <w:szCs w:val="20"/>
+              </w:rPr>
+              <w:t xml:space="preserve">Odpovědi na otázky k ISMS (jak to děláme)</w:t>
+            </w:r>
+          </w:p>
+        </w:tc>
+        <w:tc>
+          <w:tcPr>
+            <w:tcW w:type="dxa" w:w="4426"/>
+            <w:tcBorders>
+              <w:top w:val="single" w:color="BBBBBB" w:sz="1"/>
+              <w:left w:val="single" w:color="BBBBBB" w:sz="1"/>
+              <w:bottom w:val="single" w:color="BBBBBB" w:sz="1"/>
+              <w:right w:val="single" w:color="BBBBBB" w:sz="1"/>
+            </w:tcBorders>
+            <w:tcMar>
+              <w:top w:type="dxa" w:w="60"/>
+              <w:left w:type="dxa" w:w="110"/>
+              <w:bottom w:type="dxa" w:w="60"/>
+              <w:right w:type="dxa" w:w="110"/>
+            </w:tcMar>
+            <w:vAlign w:val="center"/>
+          </w:tcPr>
+          <w:p>
+            <w:pPr>
+              <w:spacing w:after="0" w:line="252"/>
+            </w:pPr>
+            <w:r>
+              <w:rPr>
+                <w:b w:val="false"/>
+                <w:bCs w:val="false"/>
+                <w:sz w:val="20"/>
+                <w:szCs w:val="20"/>
+              </w:rPr>
+              <w:t xml:space="preserve">DOC-00</w:t>
+            </w:r>
+          </w:p>
+        </w:tc>
+      </w:tr>
+      <w:tr>
+        <w:tc>
+          <w:tcPr>
+            <w:tcW w:type="dxa" w:w="1200"/>
+            <w:tcBorders>
+              <w:top w:val="single" w:color="BBBBBB" w:sz="1"/>
+              <w:left w:val="single" w:color="BBBBBB" w:sz="1"/>
+              <w:bottom w:val="single" w:color="BBBBBB" w:sz="1"/>
+              <w:right w:val="single" w:color="BBBBBB" w:sz="1"/>
+            </w:tcBorders>
+            <w:tcMar>
+              <w:top w:type="dxa" w:w="60"/>
+              <w:left w:type="dxa" w:w="110"/>
+              <w:bottom w:type="dxa" w:w="60"/>
+              <w:right w:type="dxa" w:w="110"/>
+            </w:tcMar>
+            <w:vAlign w:val="center"/>
+          </w:tcPr>
+          <w:p>
+            <w:pPr>
+              <w:spacing w:after="0" w:line="252"/>
+            </w:pPr>
+            <w:r>
+              <w:rPr>
+                <w:b w:val="false"/>
+                <w:bCs w:val="false"/>
+                <w:sz w:val="20"/>
+                <w:szCs w:val="20"/>
+              </w:rPr>
+              <w:t xml:space="preserve">ZAZ-05-01</w:t>
+            </w:r>
+          </w:p>
+        </w:tc>
+        <w:tc>
+          <w:tcPr>
+            <w:tcW w:type="dxa" w:w="3400"/>
+            <w:tcBorders>
+              <w:top w:val="single" w:color="BBBBBB" w:sz="1"/>
+              <w:left w:val="single" w:color="BBBBBB" w:sz="1"/>
+              <w:bottom w:val="single" w:color="BBBBBB" w:sz="1"/>
+              <w:right w:val="single" w:color="BBBBBB" w:sz="1"/>
+            </w:tcBorders>
+            <w:tcMar>
+              <w:top w:type="dxa" w:w="60"/>
+              <w:left w:type="dxa" w:w="110"/>
+              <w:bottom w:type="dxa" w:w="60"/>
+              <w:right w:type="dxa" w:w="110"/>
+            </w:tcMar>
+            <w:vAlign w:val="center"/>
+          </w:tcPr>
+          <w:p>
+            <w:pPr>
+              <w:spacing w:after="0" w:line="252"/>
+            </w:pPr>
+            <w:r>
+              <w:rPr>
+                <w:b w:val="false"/>
+                <w:bCs w:val="false"/>
+                <w:sz w:val="20"/>
+                <w:szCs w:val="20"/>
+              </w:rPr>
+              <w:t xml:space="preserve">Revize registru rizik</w:t>
+            </w:r>
+          </w:p>
+        </w:tc>
+        <w:tc>
+          <w:tcPr>
+            <w:tcW w:type="dxa" w:w="4426"/>
+            <w:tcBorders>
+              <w:top w:val="single" w:color="BBBBBB" w:sz="1"/>
+              <w:left w:val="single" w:color="BBBBBB" w:sz="1"/>
+              <w:bottom w:val="single" w:color="BBBBBB" w:sz="1"/>
+              <w:right w:val="single" w:color="BBBBBB" w:sz="1"/>
+            </w:tcBorders>
+            <w:tcMar>
+              <w:top w:type="dxa" w:w="60"/>
+              <w:left w:type="dxa" w:w="110"/>
+              <w:bottom w:type="dxa" w:w="60"/>
+              <w:right w:type="dxa" w:w="110"/>
+            </w:tcMar>
+            <w:vAlign w:val="center"/>
+          </w:tcPr>
+          <w:p>
+            <w:pPr>
+              <w:spacing w:after="0" w:line="252"/>
+            </w:pPr>
+            <w:r>
+              <w:rPr>
+                <w:b w:val="false"/>
+                <w:bCs w:val="false"/>
+                <w:sz w:val="20"/>
+                <w:szCs w:val="20"/>
+              </w:rPr>
+              <w:t xml:space="preserve">DOC-05</w:t>
+            </w:r>
+          </w:p>
+        </w:tc>
+      </w:tr>
+      <w:tr>
+        <w:tc>
+          <w:tcPr>
+            <w:tcW w:type="dxa" w:w="1200"/>
+            <w:tcBorders>
+              <w:top w:val="single" w:color="BBBBBB" w:sz="1"/>
+              <w:left w:val="single" w:color="BBBBBB" w:sz="1"/>
+              <w:bottom w:val="single" w:color="BBBBBB" w:sz="1"/>
+              <w:right w:val="single" w:color="BBBBBB" w:sz="1"/>
+            </w:tcBorders>
+            <w:tcMar>
+              <w:top w:type="dxa" w:w="60"/>
+              <w:left w:type="dxa" w:w="110"/>
+              <w:bottom w:type="dxa" w:w="60"/>
+              <w:right w:type="dxa" w:w="110"/>
+            </w:tcMar>
+            <w:vAlign w:val="center"/>
+          </w:tcPr>
+          <w:p>
+            <w:pPr>
+              <w:spacing w:after="0" w:line="252"/>
+            </w:pPr>
+            <w:r>
+              <w:rPr>
+                <w:b w:val="false"/>
+                <w:bCs w:val="false"/>
+                <w:sz w:val="20"/>
+                <w:szCs w:val="20"/>
+              </w:rPr>
+              <w:t xml:space="preserve">ZAZ-09-01</w:t>
+            </w:r>
+          </w:p>
+        </w:tc>
+        <w:tc>
+          <w:tcPr>
+            <w:tcW w:type="dxa" w:w="3400"/>
+            <w:tcBorders>
+              <w:top w:val="single" w:color="BBBBBB" w:sz="1"/>
+              <w:left w:val="single" w:color="BBBBBB" w:sz="1"/>
+              <w:bottom w:val="single" w:color="BBBBBB" w:sz="1"/>
+              <w:right w:val="single" w:color="BBBBBB" w:sz="1"/>
+            </w:tcBorders>
+            <w:tcMar>
+              <w:top w:type="dxa" w:w="60"/>
+              <w:left w:type="dxa" w:w="110"/>
+              <w:bottom w:type="dxa" w:w="60"/>
+              <w:right w:type="dxa" w:w="110"/>
+            </w:tcMar>
+            <w:vAlign w:val="center"/>
+          </w:tcPr>
+          <w:p>
+            <w:pPr>
+              <w:spacing w:after="0" w:line="252"/>
+            </w:pPr>
+            <w:r>
+              <w:rPr>
+                <w:b w:val="false"/>
+                <w:bCs w:val="false"/>
+                <w:sz w:val="20"/>
+                <w:szCs w:val="20"/>
+              </w:rPr>
+              <w:t xml:space="preserve">Přezkum přístupových práv</w:t>
+            </w:r>
+          </w:p>
+        </w:tc>
+        <w:tc>
+          <w:tcPr>
+            <w:tcW w:type="dxa" w:w="4426"/>
+            <w:tcBorders>
+              <w:top w:val="single" w:color="BBBBBB" w:sz="1"/>
+              <w:left w:val="single" w:color="BBBBBB" w:sz="1"/>
+              <w:bottom w:val="single" w:color="BBBBBB" w:sz="1"/>
+              <w:right w:val="single" w:color="BBBBBB" w:sz="1"/>
+            </w:tcBorders>
+            <w:tcMar>
+              <w:top w:type="dxa" w:w="60"/>
+              <w:left w:type="dxa" w:w="110"/>
+              <w:bottom w:type="dxa" w:w="60"/>
+              <w:right w:type="dxa" w:w="110"/>
+            </w:tcMar>
+            <w:vAlign w:val="center"/>
+          </w:tcPr>
+          <w:p>
+            <w:pPr>
+              <w:spacing w:after="0" w:line="252"/>
+            </w:pPr>
+            <w:r>
+              <w:rPr>
+                <w:b w:val="false"/>
+                <w:bCs w:val="false"/>
+                <w:sz w:val="20"/>
+                <w:szCs w:val="20"/>
+              </w:rPr>
+              <w:t xml:space="preserve">DOC-09</w:t>
+            </w:r>
+          </w:p>
+        </w:tc>
+      </w:tr>
+      <w:tr>
+        <w:tc>
+          <w:tcPr>
+            <w:tcW w:type="dxa" w:w="1200"/>
+            <w:tcBorders>
+              <w:top w:val="single" w:color="BBBBBB" w:sz="1"/>
+              <w:left w:val="single" w:color="BBBBBB" w:sz="1"/>
+              <w:bottom w:val="single" w:color="BBBBBB" w:sz="1"/>
+              <w:right w:val="single" w:color="BBBBBB" w:sz="1"/>
+            </w:tcBorders>
+            <w:tcMar>
+              <w:top w:type="dxa" w:w="60"/>
+              <w:left w:type="dxa" w:w="110"/>
+              <w:bottom w:type="dxa" w:w="60"/>
+              <w:right w:type="dxa" w:w="110"/>
+            </w:tcMar>
+            <w:vAlign w:val="center"/>
+          </w:tcPr>
+          <w:p>
+            <w:pPr>
+              <w:spacing w:after="0" w:line="252"/>
+            </w:pPr>
+            <w:r>
+              <w:rPr>
+                <w:b w:val="false"/>
+                <w:bCs w:val="false"/>
+                <w:sz w:val="20"/>
+                <w:szCs w:val="20"/>
+              </w:rPr>
+              <w:t xml:space="preserve">ZAZ-11-01</w:t>
+            </w:r>
+          </w:p>
+        </w:tc>
+        <w:tc>
+          <w:tcPr>
+            <w:tcW w:type="dxa" w:w="3400"/>
+            <w:tcBorders>
+              <w:top w:val="single" w:color="BBBBBB" w:sz="1"/>
+              <w:left w:val="single" w:color="BBBBBB" w:sz="1"/>
+              <w:bottom w:val="single" w:color="BBBBBB" w:sz="1"/>
+              <w:right w:val="single" w:color="BBBBBB" w:sz="1"/>
+            </w:tcBorders>
+            <w:tcMar>
+              <w:top w:type="dxa" w:w="60"/>
+              <w:left w:type="dxa" w:w="110"/>
+              <w:bottom w:type="dxa" w:w="60"/>
+              <w:right w:type="dxa" w:w="110"/>
+            </w:tcMar>
+            <w:vAlign w:val="center"/>
+          </w:tcPr>
+          <w:p>
+            <w:pPr>
+              <w:spacing w:after="0" w:line="252"/>
+            </w:pPr>
+            <w:r>
+              <w:rPr>
+                <w:b w:val="false"/>
+                <w:bCs w:val="false"/>
+                <w:sz w:val="20"/>
+                <w:szCs w:val="20"/>
+              </w:rPr>
+              <w:t xml:space="preserve">Test obnovy ze zálohy (restore drill)</w:t>
+            </w:r>
+          </w:p>
+        </w:tc>
+        <w:tc>
+          <w:tcPr>
+            <w:tcW w:type="dxa" w:w="4426"/>
+            <w:tcBorders>
+              <w:top w:val="single" w:color="BBBBBB" w:sz="1"/>
+              <w:left w:val="single" w:color="BBBBBB" w:sz="1"/>
+              <w:bottom w:val="single" w:color="BBBBBB" w:sz="1"/>
+              <w:right w:val="single" w:color="BBBBBB" w:sz="1"/>
+            </w:tcBorders>
+            <w:tcMar>
+              <w:top w:type="dxa" w:w="60"/>
+              <w:left w:type="dxa" w:w="110"/>
+              <w:bottom w:type="dxa" w:w="60"/>
+              <w:right w:type="dxa" w:w="110"/>
+            </w:tcMar>
+            <w:vAlign w:val="center"/>
+          </w:tcPr>
+          <w:p>
+            <w:pPr>
+              <w:spacing w:after="0" w:line="252"/>
+            </w:pPr>
+            <w:r>
+              <w:rPr>
+                <w:b w:val="false"/>
+                <w:bCs w:val="false"/>
+                <w:sz w:val="20"/>
+                <w:szCs w:val="20"/>
+              </w:rPr>
+              <w:t xml:space="preserve">DOC-11</w:t>
+            </w:r>
+          </w:p>
+        </w:tc>
+      </w:tr>
+      <w:tr>
+        <w:tc>
+          <w:tcPr>
+            <w:tcW w:type="dxa" w:w="1200"/>
+            <w:tcBorders>
+              <w:top w:val="single" w:color="BBBBBB" w:sz="1"/>
+              <w:left w:val="single" w:color="BBBBBB" w:sz="1"/>
+              <w:bottom w:val="single" w:color="BBBBBB" w:sz="1"/>
+              <w:right w:val="single" w:color="BBBBBB" w:sz="1"/>
+            </w:tcBorders>
+            <w:tcMar>
+              <w:top w:type="dxa" w:w="60"/>
+              <w:left w:type="dxa" w:w="110"/>
+              <w:bottom w:type="dxa" w:w="60"/>
+              <w:right w:type="dxa" w:w="110"/>
+            </w:tcMar>
+            <w:vAlign w:val="center"/>
+          </w:tcPr>
+          <w:p>
+            <w:pPr>
+              <w:spacing w:after="0" w:line="252"/>
+            </w:pPr>
+            <w:r>
+              <w:rPr>
+                <w:b w:val="false"/>
+                <w:bCs w:val="false"/>
+                <w:sz w:val="20"/>
+                <w:szCs w:val="20"/>
+              </w:rPr>
+              <w:t xml:space="preserve">ZAZ-11-02</w:t>
+            </w:r>
+          </w:p>
+        </w:tc>
+        <w:tc>
+          <w:tcPr>
+            <w:tcW w:type="dxa" w:w="3400"/>
+            <w:tcBorders>
+              <w:top w:val="single" w:color="BBBBBB" w:sz="1"/>
+              <w:left w:val="single" w:color="BBBBBB" w:sz="1"/>
+              <w:bottom w:val="single" w:color="BBBBBB" w:sz="1"/>
+              <w:right w:val="single" w:color="BBBBBB" w:sz="1"/>
+            </w:tcBorders>
+            <w:tcMar>
+              <w:top w:type="dxa" w:w="60"/>
+              <w:left w:type="dxa" w:w="110"/>
+              <w:bottom w:type="dxa" w:w="60"/>
+              <w:right w:type="dxa" w:w="110"/>
+            </w:tcMar>
+            <w:vAlign w:val="center"/>
+          </w:tcPr>
+          <w:p>
+            <w:pPr>
+              <w:spacing w:after="0" w:line="252"/>
+            </w:pPr>
+            <w:r>
+              <w:rPr>
+                <w:b w:val="false"/>
+                <w:bCs w:val="false"/>
+                <w:sz w:val="20"/>
+                <w:szCs w:val="20"/>
+              </w:rPr>
+              <w:t xml:space="preserve">Test plánu kontinuity (BCP)</w:t>
+            </w:r>
+          </w:p>
+        </w:tc>
+        <w:tc>
+          <w:tcPr>
+            <w:tcW w:type="dxa" w:w="4426"/>
+            <w:tcBorders>
+              <w:top w:val="single" w:color="BBBBBB" w:sz="1"/>
+              <w:left w:val="single" w:color="BBBBBB" w:sz="1"/>
+              <w:bottom w:val="single" w:color="BBBBBB" w:sz="1"/>
+              <w:right w:val="single" w:color="BBBBBB" w:sz="1"/>
+            </w:tcBorders>
+            <w:tcMar>
+              <w:top w:type="dxa" w:w="60"/>
+              <w:left w:type="dxa" w:w="110"/>
+              <w:bottom w:type="dxa" w:w="60"/>
+              <w:right w:type="dxa" w:w="110"/>
+            </w:tcMar>
+            <w:vAlign w:val="center"/>
+          </w:tcPr>
+          <w:p>
+            <w:pPr>
+              <w:spacing w:after="0" w:line="252"/>
+            </w:pPr>
+            <w:r>
+              <w:rPr>
+                <w:b w:val="false"/>
+                <w:bCs w:val="false"/>
+                <w:sz w:val="20"/>
+                <w:szCs w:val="20"/>
+              </w:rPr>
+              <w:t xml:space="preserve">DOC-11</w:t>
+            </w:r>
+          </w:p>
+        </w:tc>
+      </w:tr>
+      <w:tr>
+        <w:tc>
+          <w:tcPr>
+            <w:tcW w:type="dxa" w:w="1200"/>
+            <w:tcBorders>
+              <w:top w:val="single" w:color="BBBBBB" w:sz="1"/>
+              <w:left w:val="single" w:color="BBBBBB" w:sz="1"/>
+              <w:bottom w:val="single" w:color="BBBBBB" w:sz="1"/>
+              <w:right w:val="single" w:color="BBBBBB" w:sz="1"/>
+            </w:tcBorders>
+            <w:tcMar>
+              <w:top w:type="dxa" w:w="60"/>
+              <w:left w:type="dxa" w:w="110"/>
+              <w:bottom w:type="dxa" w:w="60"/>
+              <w:right w:type="dxa" w:w="110"/>
+            </w:tcMar>
+            <w:vAlign w:val="center"/>
+          </w:tcPr>
+          <w:p>
+            <w:pPr>
+              <w:spacing w:after="0" w:line="252"/>
+            </w:pPr>
+            <w:r>
+              <w:rPr>
+                <w:b w:val="false"/>
+                <w:bCs w:val="false"/>
+                <w:sz w:val="20"/>
+                <w:szCs w:val="20"/>
+              </w:rPr>
+              <w:t xml:space="preserve">ZAZ-12-01</w:t>
+            </w:r>
+          </w:p>
+        </w:tc>
+        <w:tc>
+          <w:tcPr>
+            <w:tcW w:type="dxa" w:w="3400"/>
+            <w:tcBorders>
+              <w:top w:val="single" w:color="BBBBBB" w:sz="1"/>
+              <w:left w:val="single" w:color="BBBBBB" w:sz="1"/>
+              <w:bottom w:val="single" w:color="BBBBBB" w:sz="1"/>
+              <w:right w:val="single" w:color="BBBBBB" w:sz="1"/>
+            </w:tcBorders>
+            <w:tcMar>
+              <w:top w:type="dxa" w:w="60"/>
+              <w:left w:type="dxa" w:w="110"/>
+              <w:bottom w:type="dxa" w:w="60"/>
+              <w:right w:type="dxa" w:w="110"/>
+            </w:tcMar>
+            <w:vAlign w:val="center"/>
+          </w:tcPr>
+          <w:p>
+            <w:pPr>
+              <w:spacing w:after="0" w:line="252"/>
+            </w:pPr>
+            <w:r>
+              <w:rPr>
+                <w:b w:val="false"/>
+                <w:bCs w:val="false"/>
+                <w:sz w:val="20"/>
+                <w:szCs w:val="20"/>
+              </w:rPr>
+              <w:t xml:space="preserve">Revize a hodnocení dodavatelů</w:t>
+            </w:r>
+          </w:p>
+        </w:tc>
+        <w:tc>
+          <w:tcPr>
+            <w:tcW w:type="dxa" w:w="4426"/>
+            <w:tcBorders>
+              <w:top w:val="single" w:color="BBBBBB" w:sz="1"/>
+              <w:left w:val="single" w:color="BBBBBB" w:sz="1"/>
+              <w:bottom w:val="single" w:color="BBBBBB" w:sz="1"/>
+              <w:right w:val="single" w:color="BBBBBB" w:sz="1"/>
+            </w:tcBorders>
+            <w:tcMar>
+              <w:top w:type="dxa" w:w="60"/>
+              <w:left w:type="dxa" w:w="110"/>
+              <w:bottom w:type="dxa" w:w="60"/>
+              <w:right w:type="dxa" w:w="110"/>
+            </w:tcMar>
+            <w:vAlign w:val="center"/>
+          </w:tcPr>
+          <w:p>
+            <w:pPr>
+              <w:spacing w:after="0" w:line="252"/>
+            </w:pPr>
+            <w:r>
+              <w:rPr>
+                <w:b w:val="false"/>
+                <w:bCs w:val="false"/>
+                <w:sz w:val="20"/>
+                <w:szCs w:val="20"/>
+              </w:rPr>
+              <w:t xml:space="preserve">DOC-12</w:t>
+            </w:r>
+          </w:p>
+        </w:tc>
+      </w:tr>
+      <w:tr>
+        <w:tc>
+          <w:tcPr>
+            <w:tcW w:type="dxa" w:w="1200"/>
+            <w:tcBorders>
+              <w:top w:val="single" w:color="BBBBBB" w:sz="1"/>
+              <w:left w:val="single" w:color="BBBBBB" w:sz="1"/>
+              <w:bottom w:val="single" w:color="BBBBBB" w:sz="1"/>
+              <w:right w:val="single" w:color="BBBBBB" w:sz="1"/>
+            </w:tcBorders>
+            <w:tcMar>
+              <w:top w:type="dxa" w:w="60"/>
+              <w:left w:type="dxa" w:w="110"/>
+              <w:bottom w:type="dxa" w:w="60"/>
+              <w:right w:type="dxa" w:w="110"/>
+            </w:tcMar>
+            <w:vAlign w:val="center"/>
+          </w:tcPr>
+          <w:p>
+            <w:pPr>
+              <w:spacing w:after="0" w:line="252"/>
+            </w:pPr>
+            <w:r>
+              <w:rPr>
+                <w:b w:val="false"/>
+                <w:bCs w:val="false"/>
+                <w:sz w:val="20"/>
+                <w:szCs w:val="20"/>
+              </w:rPr>
+              <w:t xml:space="preserve">ZAZ-13-01</w:t>
+            </w:r>
+          </w:p>
+        </w:tc>
+        <w:tc>
+          <w:tcPr>
+            <w:tcW w:type="dxa" w:w="3400"/>
+            <w:tcBorders>
+              <w:top w:val="single" w:color="BBBBBB" w:sz="1"/>
+              <w:left w:val="single" w:color="BBBBBB" w:sz="1"/>
+              <w:bottom w:val="single" w:color="BBBBBB" w:sz="1"/>
+              <w:right w:val="single" w:color="BBBBBB" w:sz="1"/>
+            </w:tcBorders>
+            <w:tcMar>
+              <w:top w:type="dxa" w:w="60"/>
+              <w:left w:type="dxa" w:w="110"/>
+              <w:bottom w:type="dxa" w:w="60"/>
+              <w:right w:type="dxa" w:w="110"/>
+            </w:tcMar>
+            <w:vAlign w:val="center"/>
+          </w:tcPr>
+          <w:p>
+            <w:pPr>
+              <w:spacing w:after="0" w:line="252"/>
+            </w:pPr>
+            <w:r>
+              <w:rPr>
+                <w:b w:val="false"/>
+                <w:bCs w:val="false"/>
+                <w:sz w:val="20"/>
+                <w:szCs w:val="20"/>
+              </w:rPr>
+              <w:t xml:space="preserve">Školení bezpečnosti</w:t>
+            </w:r>
+          </w:p>
+        </w:tc>
+        <w:tc>
+          <w:tcPr>
+            <w:tcW w:type="dxa" w:w="4426"/>
+            <w:tcBorders>
+              <w:top w:val="single" w:color="BBBBBB" w:sz="1"/>
+              <w:left w:val="single" w:color="BBBBBB" w:sz="1"/>
+              <w:bottom w:val="single" w:color="BBBBBB" w:sz="1"/>
+              <w:right w:val="single" w:color="BBBBBB" w:sz="1"/>
+            </w:tcBorders>
+            <w:tcMar>
+              <w:top w:type="dxa" w:w="60"/>
+              <w:left w:type="dxa" w:w="110"/>
+              <w:bottom w:type="dxa" w:w="60"/>
+              <w:right w:type="dxa" w:w="110"/>
+            </w:tcMar>
+            <w:vAlign w:val="center"/>
+          </w:tcPr>
+          <w:p>
+            <w:pPr>
+              <w:spacing w:after="0" w:line="252"/>
+            </w:pPr>
+            <w:r>
+              <w:rPr>
+                <w:b w:val="false"/>
+                <w:bCs w:val="false"/>
+                <w:sz w:val="20"/>
+                <w:szCs w:val="20"/>
+              </w:rPr>
+              <w:t xml:space="preserve">DOC-13</w:t>
+            </w:r>
+          </w:p>
+        </w:tc>
+      </w:tr>
+      <w:tr>
+        <w:tc>
+          <w:tcPr>
+            <w:tcW w:type="dxa" w:w="1200"/>
+            <w:tcBorders>
+              <w:top w:val="single" w:color="BBBBBB" w:sz="1"/>
+              <w:left w:val="single" w:color="BBBBBB" w:sz="1"/>
+              <w:bottom w:val="single" w:color="BBBBBB" w:sz="1"/>
+              <w:right w:val="single" w:color="BBBBBB" w:sz="1"/>
+            </w:tcBorders>
+            <w:tcMar>
+              <w:top w:type="dxa" w:w="60"/>
+              <w:left w:type="dxa" w:w="110"/>
+              <w:bottom w:type="dxa" w:w="60"/>
+              <w:right w:type="dxa" w:w="110"/>
+            </w:tcMar>
+            <w:vAlign w:val="center"/>
+          </w:tcPr>
+          <w:p>
+            <w:pPr>
+              <w:spacing w:after="0" w:line="252"/>
+            </w:pPr>
+            <w:r>
+              <w:rPr>
+                <w:b w:val="false"/>
+                <w:bCs w:val="false"/>
+                <w:sz w:val="20"/>
+                <w:szCs w:val="20"/>
+              </w:rPr>
+              <w:t xml:space="preserve">ZAZ-14-01</w:t>
+            </w:r>
+          </w:p>
+        </w:tc>
+        <w:tc>
+          <w:tcPr>
+            <w:tcW w:type="dxa" w:w="3400"/>
+            <w:tcBorders>
+              <w:top w:val="single" w:color="BBBBBB" w:sz="1"/>
+              <w:left w:val="single" w:color="BBBBBB" w:sz="1"/>
+              <w:bottom w:val="single" w:color="BBBBBB" w:sz="1"/>
+              <w:right w:val="single" w:color="BBBBBB" w:sz="1"/>
+            </w:tcBorders>
+            <w:tcMar>
+              <w:top w:type="dxa" w:w="60"/>
+              <w:left w:type="dxa" w:w="110"/>
+              <w:bottom w:type="dxa" w:w="60"/>
+              <w:right w:type="dxa" w:w="110"/>
+            </w:tcMar>
+            <w:vAlign w:val="center"/>
+          </w:tcPr>
+          <w:p>
+            <w:pPr>
+              <w:spacing w:after="0" w:line="252"/>
+            </w:pPr>
+            <w:r>
+              <w:rPr>
+                <w:b w:val="false"/>
+                <w:bCs w:val="false"/>
+                <w:sz w:val="20"/>
+                <w:szCs w:val="20"/>
+              </w:rPr>
+              <w:t xml:space="preserve">Sken zranitelností (CVE)</w:t>
+            </w:r>
+          </w:p>
+        </w:tc>
+        <w:tc>
+          <w:tcPr>
+            <w:tcW w:type="dxa" w:w="4426"/>
+            <w:tcBorders>
+              <w:top w:val="single" w:color="BBBBBB" w:sz="1"/>
+              <w:left w:val="single" w:color="BBBBBB" w:sz="1"/>
+              <w:bottom w:val="single" w:color="BBBBBB" w:sz="1"/>
+              <w:right w:val="single" w:color="BBBBBB" w:sz="1"/>
+            </w:tcBorders>
+            <w:tcMar>
+              <w:top w:type="dxa" w:w="60"/>
+              <w:left w:type="dxa" w:w="110"/>
+              <w:bottom w:type="dxa" w:w="60"/>
+              <w:right w:type="dxa" w:w="110"/>
+            </w:tcMar>
+            <w:vAlign w:val="center"/>
+          </w:tcPr>
+          <w:p>
+            <w:pPr>
+              <w:spacing w:after="0" w:line="252"/>
+            </w:pPr>
+            <w:r>
+              <w:rPr>
+                <w:b w:val="false"/>
+                <w:bCs w:val="false"/>
+                <w:sz w:val="20"/>
+                <w:szCs w:val="20"/>
+              </w:rPr>
+              <w:t xml:space="preserve">DOC-14</w:t>
+            </w:r>
+          </w:p>
+        </w:tc>
+      </w:tr>
+      <w:tr>
+        <w:tc>
+          <w:tcPr>
+            <w:tcW w:type="dxa" w:w="1200"/>
+            <w:tcBorders>
+              <w:top w:val="single" w:color="BBBBBB" w:sz="1"/>
+              <w:left w:val="single" w:color="BBBBBB" w:sz="1"/>
+              <w:bottom w:val="single" w:color="BBBBBB" w:sz="1"/>
+              <w:right w:val="single" w:color="BBBBBB" w:sz="1"/>
+            </w:tcBorders>
+            <w:tcMar>
+              <w:top w:type="dxa" w:w="60"/>
+              <w:left w:type="dxa" w:w="110"/>
+              <w:bottom w:type="dxa" w:w="60"/>
+              <w:right w:type="dxa" w:w="110"/>
+            </w:tcMar>
+            <w:vAlign w:val="center"/>
+          </w:tcPr>
+          <w:p>
+            <w:pPr>
+              <w:spacing w:after="0" w:line="252"/>
+            </w:pPr>
+            <w:r>
+              <w:rPr>
+                <w:b w:val="false"/>
+                <w:bCs w:val="false"/>
+                <w:sz w:val="20"/>
+                <w:szCs w:val="20"/>
+              </w:rPr>
+              <w:t xml:space="preserve">ZAZ-16-01</w:t>
+            </w:r>
+          </w:p>
+        </w:tc>
+        <w:tc>
+          <w:tcPr>
+            <w:tcW w:type="dxa" w:w="3400"/>
+            <w:tcBorders>
+              <w:top w:val="single" w:color="BBBBBB" w:sz="1"/>
+              <w:left w:val="single" w:color="BBBBBB" w:sz="1"/>
+              <w:bottom w:val="single" w:color="BBBBBB" w:sz="1"/>
+              <w:right w:val="single" w:color="BBBBBB" w:sz="1"/>
+            </w:tcBorders>
+            <w:tcMar>
+              <w:top w:type="dxa" w:w="60"/>
+              <w:left w:type="dxa" w:w="110"/>
+              <w:bottom w:type="dxa" w:w="60"/>
+              <w:right w:type="dxa" w:w="110"/>
+            </w:tcMar>
+            <w:vAlign w:val="center"/>
+          </w:tcPr>
+          <w:p>
+            <w:pPr>
+              <w:spacing w:after="0" w:line="252"/>
+            </w:pPr>
+            <w:r>
+              <w:rPr>
+                <w:b w:val="false"/>
+                <w:bCs w:val="false"/>
+                <w:sz w:val="20"/>
+                <w:szCs w:val="20"/>
+              </w:rPr>
+              <w:t xml:space="preserve">Interní audit ISMS</w:t>
+            </w:r>
+          </w:p>
+        </w:tc>
+        <w:tc>
+          <w:tcPr>
+            <w:tcW w:type="dxa" w:w="4426"/>
+            <w:tcBorders>
+              <w:top w:val="single" w:color="BBBBBB" w:sz="1"/>
+              <w:left w:val="single" w:color="BBBBBB" w:sz="1"/>
+              <w:bottom w:val="single" w:color="BBBBBB" w:sz="1"/>
+              <w:right w:val="single" w:color="BBBBBB" w:sz="1"/>
+            </w:tcBorders>
+            <w:tcMar>
+              <w:top w:type="dxa" w:w="60"/>
+              <w:left w:type="dxa" w:w="110"/>
+              <w:bottom w:type="dxa" w:w="60"/>
+              <w:right w:type="dxa" w:w="110"/>
+            </w:tcMar>
+            <w:vAlign w:val="center"/>
+          </w:tcPr>
+          <w:p>
+            <w:pPr>
+              <w:spacing w:after="0" w:line="252"/>
+            </w:pPr>
+            <w:r>
+              <w:rPr>
+                <w:b w:val="false"/>
+                <w:bCs w:val="false"/>
+                <w:sz w:val="20"/>
+                <w:szCs w:val="20"/>
+              </w:rPr>
+              <w:t xml:space="preserve">DOC-16</w:t>
+            </w:r>
+          </w:p>
+        </w:tc>
+      </w:tr>
+      <w:tr>
+        <w:tc>
+          <w:tcPr>
+            <w:tcW w:type="dxa" w:w="1200"/>
+            <w:tcBorders>
+              <w:top w:val="single" w:color="BBBBBB" w:sz="1"/>
+              <w:left w:val="single" w:color="BBBBBB" w:sz="1"/>
+              <w:bottom w:val="single" w:color="BBBBBB" w:sz="1"/>
+              <w:right w:val="single" w:color="BBBBBB" w:sz="1"/>
+            </w:tcBorders>
+            <w:tcMar>
+              <w:top w:type="dxa" w:w="60"/>
+              <w:left w:type="dxa" w:w="110"/>
+              <w:bottom w:type="dxa" w:w="60"/>
+              <w:right w:type="dxa" w:w="110"/>
+            </w:tcMar>
+            <w:vAlign w:val="center"/>
+          </w:tcPr>
+          <w:p>
+            <w:pPr>
+              <w:spacing w:after="0" w:line="252"/>
+            </w:pPr>
+            <w:r>
+              <w:rPr>
+                <w:b w:val="false"/>
+                <w:bCs w:val="false"/>
+                <w:sz w:val="20"/>
+                <w:szCs w:val="20"/>
+              </w:rPr>
+              <w:t xml:space="preserve">ZAZ-17-01</w:t>
+            </w:r>
+          </w:p>
+        </w:tc>
+        <w:tc>
+          <w:tcPr>
+            <w:tcW w:type="dxa" w:w="3400"/>
+            <w:tcBorders>
+              <w:top w:val="single" w:color="BBBBBB" w:sz="1"/>
+              <w:left w:val="single" w:color="BBBBBB" w:sz="1"/>
+              <w:bottom w:val="single" w:color="BBBBBB" w:sz="1"/>
+              <w:right w:val="single" w:color="BBBBBB" w:sz="1"/>
+            </w:tcBorders>
+            <w:tcMar>
+              <w:top w:type="dxa" w:w="60"/>
+              <w:left w:type="dxa" w:w="110"/>
+              <w:bottom w:type="dxa" w:w="60"/>
+              <w:right w:type="dxa" w:w="110"/>
+            </w:tcMar>
+            <w:vAlign w:val="center"/>
+          </w:tcPr>
+          <w:p>
+            <w:pPr>
+              <w:spacing w:after="0" w:line="252"/>
+            </w:pPr>
+            <w:r>
+              <w:rPr>
+                <w:b w:val="false"/>
+                <w:bCs w:val="false"/>
+                <w:sz w:val="20"/>
+                <w:szCs w:val="20"/>
+              </w:rPr>
+              <w:t xml:space="preserve">Přezkoumání vedením</w:t>
+            </w:r>
+          </w:p>
+        </w:tc>
+        <w:tc>
+          <w:tcPr>
+            <w:tcW w:type="dxa" w:w="4426"/>
+            <w:tcBorders>
+              <w:top w:val="single" w:color="BBBBBB" w:sz="1"/>
+              <w:left w:val="single" w:color="BBBBBB" w:sz="1"/>
+              <w:bottom w:val="single" w:color="BBBBBB" w:sz="1"/>
+              <w:right w:val="single" w:color="BBBBBB" w:sz="1"/>
+            </w:tcBorders>
+            <w:tcMar>
+              <w:top w:type="dxa" w:w="60"/>
+              <w:left w:type="dxa" w:w="110"/>
+              <w:bottom w:type="dxa" w:w="60"/>
+              <w:right w:type="dxa" w:w="110"/>
+            </w:tcMar>
+            <w:vAlign w:val="center"/>
+          </w:tcPr>
+          <w:p>
+            <w:pPr>
+              <w:spacing w:after="0" w:line="252"/>
+            </w:pPr>
+            <w:r>
+              <w:rPr>
+                <w:b w:val="false"/>
+                <w:bCs w:val="false"/>
+                <w:sz w:val="20"/>
+                <w:szCs w:val="20"/>
+              </w:rPr>
+              <w:t xml:space="preserve">DOC-17</w:t>
+            </w:r>
+          </w:p>
+        </w:tc>
+      </w:tr>
+    </w:tbl>
+    <w:p>
+      <w:pPr>
+        <w:pStyle w:val="Heading1"/>
+      </w:pPr>
+      <w:r>
+        <w:t xml:space="preserve">4. Poznámka</w:t>
       </w:r>
     </w:p>
     <w:p>
@@ -2866,7 +4219,7 @@
         <w:sz w:val="15"/>
         <w:szCs w:val="15"/>
       </w:rPr>
-      <w:t xml:space="preserve">Seznam dokumentů ISMS  ·  verze 0.1</w:t>
+      <w:t xml:space="preserve">Seznam dokumentů ISMS  ·  verze 0.2</w:t>
     </w:r>
     <w:r>
       <w:rPr>

</xml_diff>

<commit_message>
ISO 27001: ZAZ-10-01 Evidence bezpecnostnich incidentu (k DOC-10) + DOC-00 doplnen zaznam (v0.3) - Kristy/Claude-24
</commit_message>
<xml_diff>
--- a/docs/ISO27001/DOC-00_Seznam_dokumentu_ISMS.docx
+++ b/docs/ISO27001/DOC-00_Seznam_dokumentu_ISMS.docx
@@ -196,7 +196,7 @@
                 <w:sz w:val="20"/>
                 <w:szCs w:val="20"/>
               </w:rPr>
-              <w:t xml:space="preserve">0.2 (návrh)</w:t>
+              <w:t xml:space="preserve">0.3 (návrh)</w:t>
             </w:r>
           </w:p>
         </w:tc>
@@ -940,6 +940,136 @@
                 <w:szCs w:val="20"/>
               </w:rPr>
               <w:t xml:space="preserve">Doplněn seznam návazných záznamů (řada ZAZ)</w:t>
+            </w:r>
+          </w:p>
+        </w:tc>
+        <w:tc>
+          <w:tcPr>
+            <w:tcW w:type="dxa" w:w="2000"/>
+            <w:tcBorders>
+              <w:top w:val="single" w:color="BBBBBB" w:sz="1"/>
+              <w:left w:val="single" w:color="BBBBBB" w:sz="1"/>
+              <w:bottom w:val="single" w:color="BBBBBB" w:sz="1"/>
+              <w:right w:val="single" w:color="BBBBBB" w:sz="1"/>
+            </w:tcBorders>
+            <w:tcMar>
+              <w:top w:type="dxa" w:w="60"/>
+              <w:left w:type="dxa" w:w="110"/>
+              <w:bottom w:type="dxa" w:w="60"/>
+              <w:right w:type="dxa" w:w="110"/>
+            </w:tcMar>
+            <w:vAlign w:val="center"/>
+          </w:tcPr>
+          <w:p>
+            <w:pPr>
+              <w:spacing w:after="0" w:line="252"/>
+            </w:pPr>
+            <w:r>
+              <w:rPr>
+                <w:b w:val="false"/>
+                <w:bCs w:val="false"/>
+                <w:sz w:val="20"/>
+                <w:szCs w:val="20"/>
+              </w:rPr>
+              <w:t xml:space="preserve">STRATEGIE / Claude-24</w:t>
+            </w:r>
+          </w:p>
+        </w:tc>
+      </w:tr>
+      <w:tr>
+        <w:tc>
+          <w:tcPr>
+            <w:tcW w:type="dxa" w:w="1400"/>
+            <w:tcBorders>
+              <w:top w:val="single" w:color="BBBBBB" w:sz="1"/>
+              <w:left w:val="single" w:color="BBBBBB" w:sz="1"/>
+              <w:bottom w:val="single" w:color="BBBBBB" w:sz="1"/>
+              <w:right w:val="single" w:color="BBBBBB" w:sz="1"/>
+            </w:tcBorders>
+            <w:tcMar>
+              <w:top w:type="dxa" w:w="60"/>
+              <w:left w:type="dxa" w:w="110"/>
+              <w:bottom w:type="dxa" w:w="60"/>
+              <w:right w:type="dxa" w:w="110"/>
+            </w:tcMar>
+            <w:vAlign w:val="center"/>
+          </w:tcPr>
+          <w:p>
+            <w:pPr>
+              <w:spacing w:after="0" w:line="252"/>
+            </w:pPr>
+            <w:r>
+              <w:rPr>
+                <w:b w:val="false"/>
+                <w:bCs w:val="false"/>
+                <w:sz w:val="20"/>
+                <w:szCs w:val="20"/>
+              </w:rPr>
+              <w:t xml:space="preserve">0.3</w:t>
+            </w:r>
+          </w:p>
+        </w:tc>
+        <w:tc>
+          <w:tcPr>
+            <w:tcW w:type="dxa" w:w="1800"/>
+            <w:tcBorders>
+              <w:top w:val="single" w:color="BBBBBB" w:sz="1"/>
+              <w:left w:val="single" w:color="BBBBBB" w:sz="1"/>
+              <w:bottom w:val="single" w:color="BBBBBB" w:sz="1"/>
+              <w:right w:val="single" w:color="BBBBBB" w:sz="1"/>
+            </w:tcBorders>
+            <w:tcMar>
+              <w:top w:type="dxa" w:w="60"/>
+              <w:left w:type="dxa" w:w="110"/>
+              <w:bottom w:type="dxa" w:w="60"/>
+              <w:right w:type="dxa" w:w="110"/>
+            </w:tcMar>
+            <w:vAlign w:val="center"/>
+          </w:tcPr>
+          <w:p>
+            <w:pPr>
+              <w:spacing w:after="0" w:line="252"/>
+            </w:pPr>
+            <w:r>
+              <w:rPr>
+                <w:b w:val="false"/>
+                <w:bCs w:val="false"/>
+                <w:sz w:val="20"/>
+                <w:szCs w:val="20"/>
+              </w:rPr>
+              <w:t xml:space="preserve">13. 7. 2026</w:t>
+            </w:r>
+          </w:p>
+        </w:tc>
+        <w:tc>
+          <w:tcPr>
+            <w:tcW w:type="dxa" w:w="3826"/>
+            <w:tcBorders>
+              <w:top w:val="single" w:color="BBBBBB" w:sz="1"/>
+              <w:left w:val="single" w:color="BBBBBB" w:sz="1"/>
+              <w:bottom w:val="single" w:color="BBBBBB" w:sz="1"/>
+              <w:right w:val="single" w:color="BBBBBB" w:sz="1"/>
+            </w:tcBorders>
+            <w:tcMar>
+              <w:top w:type="dxa" w:w="60"/>
+              <w:left w:type="dxa" w:w="110"/>
+              <w:bottom w:type="dxa" w:w="60"/>
+              <w:right w:type="dxa" w:w="110"/>
+            </w:tcMar>
+            <w:vAlign w:val="center"/>
+          </w:tcPr>
+          <w:p>
+            <w:pPr>
+              <w:spacing w:after="0" w:line="252"/>
+            </w:pPr>
+            <w:r>
+              <w:rPr>
+                <w:b w:val="false"/>
+                <w:bCs w:val="false"/>
+                <w:sz w:val="20"/>
+                <w:szCs w:val="20"/>
+              </w:rPr>
+              <w:t xml:space="preserve">Doplněn záznam ZAZ-10-01 (Evidence bezpečnostních incidentů)</w:t>
             </w:r>
           </w:p>
         </w:tc>
@@ -3436,6 +3566,104 @@
                 <w:szCs w:val="20"/>
               </w:rPr>
               <w:t xml:space="preserve">DOC-09</w:t>
+            </w:r>
+          </w:p>
+        </w:tc>
+      </w:tr>
+      <w:tr>
+        <w:tc>
+          <w:tcPr>
+            <w:tcW w:type="dxa" w:w="1200"/>
+            <w:tcBorders>
+              <w:top w:val="single" w:color="BBBBBB" w:sz="1"/>
+              <w:left w:val="single" w:color="BBBBBB" w:sz="1"/>
+              <w:bottom w:val="single" w:color="BBBBBB" w:sz="1"/>
+              <w:right w:val="single" w:color="BBBBBB" w:sz="1"/>
+            </w:tcBorders>
+            <w:tcMar>
+              <w:top w:type="dxa" w:w="60"/>
+              <w:left w:type="dxa" w:w="110"/>
+              <w:bottom w:type="dxa" w:w="60"/>
+              <w:right w:type="dxa" w:w="110"/>
+            </w:tcMar>
+            <w:vAlign w:val="center"/>
+          </w:tcPr>
+          <w:p>
+            <w:pPr>
+              <w:spacing w:after="0" w:line="252"/>
+            </w:pPr>
+            <w:r>
+              <w:rPr>
+                <w:b w:val="false"/>
+                <w:bCs w:val="false"/>
+                <w:sz w:val="20"/>
+                <w:szCs w:val="20"/>
+              </w:rPr>
+              <w:t xml:space="preserve">ZAZ-10-01</w:t>
+            </w:r>
+          </w:p>
+        </w:tc>
+        <w:tc>
+          <w:tcPr>
+            <w:tcW w:type="dxa" w:w="3400"/>
+            <w:tcBorders>
+              <w:top w:val="single" w:color="BBBBBB" w:sz="1"/>
+              <w:left w:val="single" w:color="BBBBBB" w:sz="1"/>
+              <w:bottom w:val="single" w:color="BBBBBB" w:sz="1"/>
+              <w:right w:val="single" w:color="BBBBBB" w:sz="1"/>
+            </w:tcBorders>
+            <w:tcMar>
+              <w:top w:type="dxa" w:w="60"/>
+              <w:left w:type="dxa" w:w="110"/>
+              <w:bottom w:type="dxa" w:w="60"/>
+              <w:right w:type="dxa" w:w="110"/>
+            </w:tcMar>
+            <w:vAlign w:val="center"/>
+          </w:tcPr>
+          <w:p>
+            <w:pPr>
+              <w:spacing w:after="0" w:line="252"/>
+            </w:pPr>
+            <w:r>
+              <w:rPr>
+                <w:b w:val="false"/>
+                <w:bCs w:val="false"/>
+                <w:sz w:val="20"/>
+                <w:szCs w:val="20"/>
+              </w:rPr>
+              <w:t xml:space="preserve">Evidence bezpečnostních incidentů</w:t>
+            </w:r>
+          </w:p>
+        </w:tc>
+        <w:tc>
+          <w:tcPr>
+            <w:tcW w:type="dxa" w:w="4426"/>
+            <w:tcBorders>
+              <w:top w:val="single" w:color="BBBBBB" w:sz="1"/>
+              <w:left w:val="single" w:color="BBBBBB" w:sz="1"/>
+              <w:bottom w:val="single" w:color="BBBBBB" w:sz="1"/>
+              <w:right w:val="single" w:color="BBBBBB" w:sz="1"/>
+            </w:tcBorders>
+            <w:tcMar>
+              <w:top w:type="dxa" w:w="60"/>
+              <w:left w:type="dxa" w:w="110"/>
+              <w:bottom w:type="dxa" w:w="60"/>
+              <w:right w:type="dxa" w:w="110"/>
+            </w:tcMar>
+            <w:vAlign w:val="center"/>
+          </w:tcPr>
+          <w:p>
+            <w:pPr>
+              <w:spacing w:after="0" w:line="252"/>
+            </w:pPr>
+            <w:r>
+              <w:rPr>
+                <w:b w:val="false"/>
+                <w:bCs w:val="false"/>
+                <w:sz w:val="20"/>
+                <w:szCs w:val="20"/>
+              </w:rPr>
+              <w:t xml:space="preserve">DOC-10</w:t>
             </w:r>
           </w:p>
         </w:tc>
@@ -4219,7 +4447,7 @@
         <w:sz w:val="15"/>
         <w:szCs w:val="15"/>
       </w:rPr>
-      <w:t xml:space="preserve">Seznam dokumentů ISMS  ·  verze 0.2</w:t>
+      <w:t xml:space="preserve">Seznam dokumentů ISMS  ·  verze 0.3</w:t>
     </w:r>
     <w:r>
       <w:rPr>

</xml_diff>